<commit_message>
update portfolio content and theme
</commit_message>
<xml_diff>
--- a/assets/CV_cn.docx
+++ b/assets/CV_cn.docx
@@ -1,6 +1,6 @@
 
 <file path=word/document.xml><?xml version="1.0" encoding="utf-8"?>
-<w:document xmlns:wpc="http://schemas.microsoft.com/office/word/2010/wordprocessingCanvas" xmlns:cx="http://schemas.microsoft.com/office/drawing/2014/chartex" xmlns:cx1="http://schemas.microsoft.com/office/drawing/2015/9/8/chartex" xmlns:cx2="http://schemas.microsoft.com/office/drawing/2015/10/21/chartex" xmlns:cx3="http://schemas.microsoft.com/office/drawing/2016/5/9/chartex" xmlns:cx4="http://schemas.microsoft.com/office/drawing/2016/5/10/chartex" xmlns:cx5="http://schemas.microsoft.com/office/drawing/2016/5/11/chartex" xmlns:cx6="http://schemas.microsoft.com/office/drawing/2016/5/12/chartex" xmlns:cx7="http://schemas.microsoft.com/office/drawing/2016/5/13/chartex" xmlns:cx8="http://schemas.microsoft.com/office/drawing/2016/5/14/chartex" xmlns:mc="http://schemas.openxmlformats.org/markup-compatibility/2006" xmlns:aink="http://schemas.microsoft.com/office/drawing/2016/ink" xmlns:am3d="http://schemas.microsoft.com/office/drawing/2017/model3d" xmlns:o="urn:schemas-microsoft-com:office:office" xmlns:oel="http://schemas.microsoft.com/office/2019/extlst" xmlns:r="http://schemas.openxmlformats.org/officeDocument/2006/relationships" xmlns:m="http://schemas.openxmlformats.org/officeDocument/2006/math" xmlns:v="urn:schemas-microsoft-com:vml" xmlns:wp14="http://schemas.microsoft.com/office/word/2010/wordprocessingDrawing" xmlns:wp="http://schemas.openxmlformats.org/drawingml/2006/wordprocessingDrawing" xmlns:w10="urn:schemas-microsoft-com:office:word" xmlns:w="http://schemas.openxmlformats.org/wordprocessingml/2006/main" xmlns:w14="http://schemas.microsoft.com/office/word/2010/wordml" xmlns:w15="http://schemas.microsoft.com/office/word/2012/wordml" xmlns:w16cex="http://schemas.microsoft.com/office/word/2018/wordml/cex" xmlns:w16cid="http://schemas.microsoft.com/office/word/2016/wordml/cid" xmlns:w16="http://schemas.microsoft.com/office/word/2018/wordml" xmlns:w16du="http://schemas.microsoft.com/office/word/2023/wordml/word16du" xmlns:w16sdtdh="http://schemas.microsoft.com/office/word/2020/wordml/sdtdatahash" xmlns:w16sdtfl="http://schemas.microsoft.com/office/word/2024/wordml/sdtformatlock" xmlns:w16se="http://schemas.microsoft.com/office/word/2015/wordml/symex" xmlns:wpg="http://schemas.microsoft.com/office/word/2010/wordprocessingGroup" xmlns:wpi="http://schemas.microsoft.com/office/word/2010/wordprocessingInk" xmlns:wne="http://schemas.microsoft.com/office/word/2006/wordml" xmlns:wps="http://schemas.microsoft.com/office/word/2010/wordprocessingShape" mc:Ignorable="w14 w15 w16se w16cid w16 w16cex w16sdtdh w16sdtfl w16du wp14">
+<w:document xmlns:wpc="http://schemas.microsoft.com/office/word/2010/wordprocessingCanvas" xmlns:cx="http://schemas.microsoft.com/office/drawing/2014/chartex" xmlns:cx1="http://schemas.microsoft.com/office/drawing/2015/9/8/chartex" xmlns:cx2="http://schemas.microsoft.com/office/drawing/2015/10/21/chartex" xmlns:cx3="http://schemas.microsoft.com/office/drawing/2016/5/9/chartex" xmlns:cx4="http://schemas.microsoft.com/office/drawing/2016/5/10/chartex" xmlns:cx5="http://schemas.microsoft.com/office/drawing/2016/5/11/chartex" xmlns:cx6="http://schemas.microsoft.com/office/drawing/2016/5/12/chartex" xmlns:cx7="http://schemas.microsoft.com/office/drawing/2016/5/13/chartex" xmlns:cx8="http://schemas.microsoft.com/office/drawing/2016/5/14/chartex" xmlns:mc="http://schemas.openxmlformats.org/markup-compatibility/2006" xmlns:m="http://schemas.openxmlformats.org/officeDocument/2006/math" xmlns:aink="http://schemas.microsoft.com/office/drawing/2016/ink" xmlns:am3d="http://schemas.microsoft.com/office/drawing/2017/model3d" xmlns:oel="http://schemas.microsoft.com/office/2019/extlst" xmlns:r="http://schemas.openxmlformats.org/officeDocument/2006/relationships" xmlns:wp14="http://schemas.microsoft.com/office/word/2010/wordprocessingDrawing" xmlns:wp="http://schemas.openxmlformats.org/drawingml/2006/wordprocessingDrawing" xmlns:wpg="http://schemas.microsoft.com/office/word/2010/wordprocessingGroup" xmlns:wpi="http://schemas.microsoft.com/office/word/2010/wordprocessingInk" xmlns:wps="http://schemas.microsoft.com/office/word/2010/wordprocessingShape" xmlns:o="urn:schemas-microsoft-com:office:office" xmlns:v="urn:schemas-microsoft-com:vml" xmlns:w10="urn:schemas-microsoft-com:office:word" xmlns:w="http://schemas.openxmlformats.org/wordprocessingml/2006/main" xmlns:w14="http://schemas.microsoft.com/office/word/2010/wordml" xmlns:w15="http://schemas.microsoft.com/office/word/2012/wordml" xmlns:w16cex="http://schemas.microsoft.com/office/word/2018/wordml/cex" xmlns:w16cid="http://schemas.microsoft.com/office/word/2016/wordml/cid" xmlns:w16="http://schemas.microsoft.com/office/word/2018/wordml" xmlns:w16sdtdh="http://schemas.microsoft.com/office/word/2020/wordml/sdtdatahash" xmlns:w16sdtfl="http://schemas.microsoft.com/office/word/2024/wordml/sdtformatlock" xmlns:w16se="http://schemas.microsoft.com/office/word/2015/wordml/symex" xmlns:w16du="http://schemas.microsoft.com/office/word/2023/wordml/word16du" xmlns:wne="http://schemas.microsoft.com/office/word/2006/wordml" mc:Ignorable="w14 w15 w16se w16cid w16 w16cex w16sdtdh w16sdtfl w16du wp14">
   <w:body>
     <w:p>
       <w:pPr>
@@ -66,7 +66,7 @@
       </w:r>
       <w:r>
         <w:rPr>
-          <w:rFonts w:ascii="SimHei" w:eastAsia="SimHei" w:hAnsi="SimHei"/>
+          <w:rFonts w:ascii="黑体" w:eastAsia="黑体" w:hAnsi="黑体"/>
           <w:b/>
           <w:sz w:val="32"/>
           <w:lang w:eastAsia="zh-CN"/>
@@ -96,7 +96,7 @@
         </w:pBdr>
         <w:spacing w:before="80" w:after="40"/>
         <w:rPr>
-          <w:rFonts w:ascii="SimHei" w:eastAsia="SimHei" w:hAnsi="SimHei"/>
+          <w:rFonts w:ascii="黑体" w:eastAsia="黑体" w:hAnsi="黑体"/>
           <w:b/>
           <w:sz w:val="24"/>
           <w:lang w:eastAsia="zh-CN"/>
@@ -110,7 +110,7 @@
         </w:pBdr>
         <w:spacing w:before="80" w:after="40"/>
         <w:rPr>
-          <w:rFonts w:ascii="SimHei" w:eastAsia="SimHei" w:hAnsi="SimHei"/>
+          <w:rFonts w:ascii="黑体" w:eastAsia="黑体" w:hAnsi="黑体"/>
           <w:b/>
           <w:sz w:val="24"/>
           <w:lang w:eastAsia="zh-CN"/>
@@ -126,7 +126,7 @@
       </w:pPr>
       <w:r>
         <w:rPr>
-          <w:rFonts w:ascii="SimHei" w:eastAsia="SimHei" w:hAnsi="SimHei"/>
+          <w:rFonts w:ascii="黑体" w:eastAsia="黑体" w:hAnsi="黑体"/>
           <w:b/>
           <w:sz w:val="24"/>
         </w:rPr>
@@ -160,111 +160,7 @@
             <w:pPr>
               <w:spacing w:after="0"/>
             </w:pPr>
-            <w:r>
-              <w:rPr>
-                <w:b/>
-                <w:sz w:val="22"/>
-              </w:rPr>
-              <w:t>上海晋元高级中学</w:t>
-            </w:r>
-          </w:p>
-        </w:tc>
-        <w:tc>
-          <w:tcPr>
-            <w:tcW w:w="2584" w:type="dxa"/>
-          </w:tcPr>
-          <w:p>
-            <w:pPr>
-              <w:spacing w:after="0"/>
-              <w:jc w:val="right"/>
-            </w:pPr>
-            <w:r>
-              <w:t>上海，中国</w:t>
-            </w:r>
-          </w:p>
-        </w:tc>
-      </w:tr>
-      <w:tr>
-        <w:tc>
-          <w:tcPr>
-            <w:tcW w:w="7054" w:type="dxa"/>
-          </w:tcPr>
-          <w:p>
-            <w:pPr>
-              <w:spacing w:after="0"/>
-              <w:rPr>
-                <w:lang w:eastAsia="zh-CN"/>
-              </w:rPr>
-            </w:pPr>
-            <w:r>
-              <w:t>高中</w:t>
-            </w:r>
-            <w:r>
-              <w:rPr>
-                <w:rFonts w:hint="eastAsia"/>
-                <w:lang w:eastAsia="zh-CN"/>
-              </w:rPr>
-              <w:t xml:space="preserve">           </w:t>
-            </w:r>
-          </w:p>
-        </w:tc>
-        <w:tc>
-          <w:tcPr>
-            <w:tcW w:w="2584" w:type="dxa"/>
-          </w:tcPr>
-          <w:p>
-            <w:pPr>
-              <w:spacing w:after="0"/>
-              <w:ind w:firstLineChars="50" w:firstLine="100"/>
-              <w:rPr>
-                <w:lang w:eastAsia="zh-CN"/>
-              </w:rPr>
-            </w:pPr>
-            <w:r>
-              <w:rPr>
-                <w:rFonts w:hint="eastAsia"/>
-                <w:lang w:eastAsia="zh-CN"/>
-              </w:rPr>
-              <w:t>2021年9月-2023年6月</w:t>
-            </w:r>
-          </w:p>
-        </w:tc>
-      </w:tr>
-      <w:tr>
-        <w:tc>
-          <w:tcPr>
-            <w:tcW w:w="7054" w:type="dxa"/>
-          </w:tcPr>
-          <w:p>
-            <w:pPr>
-              <w:spacing w:after="0"/>
-            </w:pPr>
-          </w:p>
-        </w:tc>
-        <w:tc>
-          <w:tcPr>
-            <w:tcW w:w="2584" w:type="dxa"/>
-          </w:tcPr>
-          <w:p>
-            <w:pPr>
-              <w:spacing w:after="0"/>
-              <w:ind w:firstLineChars="50" w:firstLine="100"/>
-              <w:rPr>
-                <w:lang w:eastAsia="zh-CN"/>
-              </w:rPr>
-            </w:pPr>
-          </w:p>
-        </w:tc>
-      </w:tr>
-      <w:tr>
-        <w:tc>
-          <w:tcPr>
-            <w:tcW w:w="7054" w:type="dxa"/>
-          </w:tcPr>
-          <w:p>
-            <w:pPr>
-              <w:spacing w:after="0"/>
-            </w:pPr>
+            <w:proofErr w:type="spellStart"/>
             <w:r>
               <w:rPr>
                 <w:b/>
@@ -272,6 +168,7 @@
               </w:rPr>
               <w:t>利兹大学</w:t>
             </w:r>
+            <w:proofErr w:type="spellEnd"/>
           </w:p>
         </w:tc>
         <w:tc>
@@ -324,6 +221,7 @@
         <w:spacing w:after="20" w:line="240" w:lineRule="auto"/>
         <w:ind w:firstLineChars="50" w:firstLine="100"/>
         <w:rPr>
+          <w:rFonts w:hint="eastAsia"/>
           <w:lang w:eastAsia="zh-CN"/>
         </w:rPr>
       </w:pPr>
@@ -331,7 +229,14 @@
         <w:rPr>
           <w:lang w:eastAsia="zh-CN"/>
         </w:rPr>
-        <w:t>GPA：3.7/4.0（相当于英国二等一学位）</w:t>
+        <w:t>GPA：</w:t>
+      </w:r>
+      <w:r>
+        <w:rPr>
+          <w:rFonts w:hint="eastAsia"/>
+          <w:lang w:eastAsia="zh-CN"/>
+        </w:rPr>
+        <w:t>预计70/100（一等学位）</w:t>
       </w:r>
     </w:p>
     <w:p>
@@ -346,7 +251,20 @@
         <w:rPr>
           <w:lang w:eastAsia="zh-CN"/>
         </w:rPr>
-        <w:t>相关课程：数据结构、算法、离散数学、操作系统、计算机体系结构、并行计算、软件工程、程序设计（C、Python、Kotlin）</w:t>
+        <w:t>相关课程：数据结构、算法、离散数学、操作系统、计算机体系结构、并行计算、软件工程、程序设计（C、Python、Kotlin</w:t>
+      </w:r>
+      <w:r>
+        <w:rPr>
+          <w:lang w:eastAsia="zh-CN"/>
+        </w:rPr>
+        <w:t>）,</w:t>
+      </w:r>
+      <w:r>
+        <w:rPr>
+          <w:rFonts w:hint="eastAsia"/>
+          <w:lang w:eastAsia="zh-CN"/>
+        </w:rPr>
+        <w:t>计算机图形，高性能计算，神经网络与深度学习</w:t>
       </w:r>
     </w:p>
     <w:p>
@@ -356,14 +274,16 @@
         </w:pBdr>
         <w:spacing w:before="80" w:after="40"/>
       </w:pPr>
+      <w:proofErr w:type="spellStart"/>
       <w:r>
         <w:rPr>
-          <w:rFonts w:ascii="SimHei" w:eastAsia="SimHei" w:hAnsi="SimHei"/>
+          <w:rFonts w:ascii="黑体" w:eastAsia="黑体" w:hAnsi="黑体"/>
           <w:b/>
           <w:sz w:val="24"/>
         </w:rPr>
         <w:t>实习经历</w:t>
       </w:r>
+      <w:proofErr w:type="spellEnd"/>
     </w:p>
     <w:tbl>
       <w:tblPr>
@@ -521,7 +441,7 @@
       </w:pPr>
       <w:r>
         <w:rPr>
-          <w:rFonts w:ascii="SimHei" w:eastAsia="SimHei" w:hAnsi="SimHei"/>
+          <w:rFonts w:ascii="黑体" w:eastAsia="黑体" w:hAnsi="黑体"/>
           <w:b/>
           <w:sz w:val="24"/>
         </w:rPr>
@@ -558,13 +478,23 @@
                 <w:lang w:eastAsia="zh-CN"/>
               </w:rPr>
             </w:pPr>
+            <w:proofErr w:type="spellStart"/>
             <w:r>
               <w:rPr>
                 <w:b/>
                 <w:sz w:val="22"/>
                 <w:lang w:eastAsia="zh-CN"/>
               </w:rPr>
-              <w:t>软件工程团队项目</w:t>
+              <w:t>Aerovantage</w:t>
+            </w:r>
+            <w:proofErr w:type="spellEnd"/>
+            <w:r>
+              <w:rPr>
+                <w:b/>
+                <w:sz w:val="22"/>
+                <w:lang w:eastAsia="zh-CN"/>
+              </w:rPr>
+              <w:t xml:space="preserve"> - 软件工程团队项目</w:t>
             </w:r>
           </w:p>
         </w:tc>
@@ -970,7 +900,7 @@
       <w:proofErr w:type="spellStart"/>
       <w:r>
         <w:rPr>
-          <w:rFonts w:ascii="SimHei" w:eastAsia="SimHei" w:hAnsi="SimHei"/>
+          <w:rFonts w:ascii="黑体" w:eastAsia="黑体" w:hAnsi="黑体"/>
           <w:b/>
           <w:sz w:val="24"/>
         </w:rPr>
@@ -1025,7 +955,7 @@
 </file>
 
 <file path=word/numbering.xml><?xml version="1.0" encoding="utf-8"?>
-<w:numbering xmlns:wpc="http://schemas.microsoft.com/office/word/2010/wordprocessingCanvas" xmlns:cx="http://schemas.microsoft.com/office/drawing/2014/chartex" xmlns:cx1="http://schemas.microsoft.com/office/drawing/2015/9/8/chartex" xmlns:cx2="http://schemas.microsoft.com/office/drawing/2015/10/21/chartex" xmlns:cx3="http://schemas.microsoft.com/office/drawing/2016/5/9/chartex" xmlns:cx4="http://schemas.microsoft.com/office/drawing/2016/5/10/chartex" xmlns:cx5="http://schemas.microsoft.com/office/drawing/2016/5/11/chartex" xmlns:cx6="http://schemas.microsoft.com/office/drawing/2016/5/12/chartex" xmlns:cx7="http://schemas.microsoft.com/office/drawing/2016/5/13/chartex" xmlns:cx8="http://schemas.microsoft.com/office/drawing/2016/5/14/chartex" xmlns:mc="http://schemas.openxmlformats.org/markup-compatibility/2006" xmlns:aink="http://schemas.microsoft.com/office/drawing/2016/ink" xmlns:am3d="http://schemas.microsoft.com/office/drawing/2017/model3d" xmlns:o="urn:schemas-microsoft-com:office:office" xmlns:oel="http://schemas.microsoft.com/office/2019/extlst" xmlns:r="http://schemas.openxmlformats.org/officeDocument/2006/relationships" xmlns:m="http://schemas.openxmlformats.org/officeDocument/2006/math" xmlns:v="urn:schemas-microsoft-com:vml" xmlns:wp14="http://schemas.microsoft.com/office/word/2010/wordprocessingDrawing" xmlns:wp="http://schemas.openxmlformats.org/drawingml/2006/wordprocessingDrawing" xmlns:w10="urn:schemas-microsoft-com:office:word" xmlns:w="http://schemas.openxmlformats.org/wordprocessingml/2006/main" xmlns:w14="http://schemas.microsoft.com/office/word/2010/wordml" xmlns:w15="http://schemas.microsoft.com/office/word/2012/wordml" xmlns:w16cex="http://schemas.microsoft.com/office/word/2018/wordml/cex" xmlns:w16cid="http://schemas.microsoft.com/office/word/2016/wordml/cid" xmlns:w16="http://schemas.microsoft.com/office/word/2018/wordml" xmlns:w16du="http://schemas.microsoft.com/office/word/2023/wordml/word16du" xmlns:w16sdtdh="http://schemas.microsoft.com/office/word/2020/wordml/sdtdatahash" xmlns:w16sdtfl="http://schemas.microsoft.com/office/word/2024/wordml/sdtformatlock" xmlns:w16se="http://schemas.microsoft.com/office/word/2015/wordml/symex" xmlns:wpg="http://schemas.microsoft.com/office/word/2010/wordprocessingGroup" xmlns:wpi="http://schemas.microsoft.com/office/word/2010/wordprocessingInk" xmlns:wne="http://schemas.microsoft.com/office/word/2006/wordml" xmlns:wps="http://schemas.microsoft.com/office/word/2010/wordprocessingShape" mc:Ignorable="w14 w15 w16se w16cid w16 w16cex w16sdtdh w16sdtfl w16du wp14">
+<w:numbering xmlns:wpc="http://schemas.microsoft.com/office/word/2010/wordprocessingCanvas" xmlns:cx="http://schemas.microsoft.com/office/drawing/2014/chartex" xmlns:cx1="http://schemas.microsoft.com/office/drawing/2015/9/8/chartex" xmlns:cx2="http://schemas.microsoft.com/office/drawing/2015/10/21/chartex" xmlns:cx3="http://schemas.microsoft.com/office/drawing/2016/5/9/chartex" xmlns:cx4="http://schemas.microsoft.com/office/drawing/2016/5/10/chartex" xmlns:cx5="http://schemas.microsoft.com/office/drawing/2016/5/11/chartex" xmlns:cx6="http://schemas.microsoft.com/office/drawing/2016/5/12/chartex" xmlns:cx7="http://schemas.microsoft.com/office/drawing/2016/5/13/chartex" xmlns:cx8="http://schemas.microsoft.com/office/drawing/2016/5/14/chartex" xmlns:mc="http://schemas.openxmlformats.org/markup-compatibility/2006" xmlns:m="http://schemas.openxmlformats.org/officeDocument/2006/math" xmlns:aink="http://schemas.microsoft.com/office/drawing/2016/ink" xmlns:am3d="http://schemas.microsoft.com/office/drawing/2017/model3d" xmlns:oel="http://schemas.microsoft.com/office/2019/extlst" xmlns:r="http://schemas.openxmlformats.org/officeDocument/2006/relationships" xmlns:wp14="http://schemas.microsoft.com/office/word/2010/wordprocessingDrawing" xmlns:wp="http://schemas.openxmlformats.org/drawingml/2006/wordprocessingDrawing" xmlns:wpg="http://schemas.microsoft.com/office/word/2010/wordprocessingGroup" xmlns:wpi="http://schemas.microsoft.com/office/word/2010/wordprocessingInk" xmlns:wps="http://schemas.microsoft.com/office/word/2010/wordprocessingShape" xmlns:o="urn:schemas-microsoft-com:office:office" xmlns:v="urn:schemas-microsoft-com:vml" xmlns:w10="urn:schemas-microsoft-com:office:word" xmlns:w="http://schemas.openxmlformats.org/wordprocessingml/2006/main" xmlns:w14="http://schemas.microsoft.com/office/word/2010/wordml" xmlns:w15="http://schemas.microsoft.com/office/word/2012/wordml" xmlns:w16cex="http://schemas.microsoft.com/office/word/2018/wordml/cex" xmlns:w16cid="http://schemas.microsoft.com/office/word/2016/wordml/cid" xmlns:w16="http://schemas.microsoft.com/office/word/2018/wordml" xmlns:w16sdtdh="http://schemas.microsoft.com/office/word/2020/wordml/sdtdatahash" xmlns:w16sdtfl="http://schemas.microsoft.com/office/word/2024/wordml/sdtformatlock" xmlns:w16se="http://schemas.microsoft.com/office/word/2015/wordml/symex" xmlns:w16du="http://schemas.microsoft.com/office/word/2023/wordml/word16du" xmlns:wne="http://schemas.microsoft.com/office/word/2006/wordml" mc:Ignorable="w14 w15 w16se w16cid w16 w16cex w16sdtdh w16sdtfl w16du wp14">
   <w:abstractNum w:abstractNumId="0" w15:restartNumberingAfterBreak="0">
     <w:nsid w:val="FFFFFF7C"/>
     <w:multiLevelType w:val="singleLevel"/>
@@ -2049,7 +1979,7 @@
 </file>
 
 <file path=word/styles.xml><?xml version="1.0" encoding="utf-8"?>
-<w:styles xmlns:mc="http://schemas.openxmlformats.org/markup-compatibility/2006" xmlns:r="http://schemas.openxmlformats.org/officeDocument/2006/relationships" xmlns:w="http://schemas.openxmlformats.org/wordprocessingml/2006/main" xmlns:w14="http://schemas.microsoft.com/office/word/2010/wordml" xmlns:w15="http://schemas.microsoft.com/office/word/2012/wordml" xmlns:w16cex="http://schemas.microsoft.com/office/word/2018/wordml/cex" xmlns:w16cid="http://schemas.microsoft.com/office/word/2016/wordml/cid" xmlns:w16="http://schemas.microsoft.com/office/word/2018/wordml" xmlns:w16du="http://schemas.microsoft.com/office/word/2023/wordml/word16du" xmlns:w16sdtdh="http://schemas.microsoft.com/office/word/2020/wordml/sdtdatahash" xmlns:w16sdtfl="http://schemas.microsoft.com/office/word/2024/wordml/sdtformatlock" xmlns:w16se="http://schemas.microsoft.com/office/word/2015/wordml/symex" mc:Ignorable="w14 w15 w16se w16cid w16 w16cex w16sdtdh w16sdtfl w16du">
+<w:styles xmlns:mc="http://schemas.openxmlformats.org/markup-compatibility/2006" xmlns:r="http://schemas.openxmlformats.org/officeDocument/2006/relationships" xmlns:w="http://schemas.openxmlformats.org/wordprocessingml/2006/main" xmlns:w14="http://schemas.microsoft.com/office/word/2010/wordml" xmlns:w15="http://schemas.microsoft.com/office/word/2012/wordml" xmlns:w16cex="http://schemas.microsoft.com/office/word/2018/wordml/cex" xmlns:w16cid="http://schemas.microsoft.com/office/word/2016/wordml/cid" xmlns:w16="http://schemas.microsoft.com/office/word/2018/wordml" xmlns:w16sdtdh="http://schemas.microsoft.com/office/word/2020/wordml/sdtdatahash" xmlns:w16sdtfl="http://schemas.microsoft.com/office/word/2024/wordml/sdtformatlock" xmlns:w16se="http://schemas.microsoft.com/office/word/2015/wordml/symex" xmlns:w16du="http://schemas.microsoft.com/office/word/2023/wordml/word16du" mc:Ignorable="w14 w15 w16se w16cid w16 w16cex w16sdtdh w16sdtfl w16du">
   <w:docDefaults>
     <w:rPrDefault>
       <w:rPr>

</xml_diff>